<commit_message>
vault backup: 2026-04-12 18:02:59
Affected files:
wkspc/chapter7_final.docx
wkspc/format_chapter7.py
wkspc/~$apter7_final.docx
</commit_message>
<xml_diff>
--- a/wkspc/chapter7_final.docx
+++ b/wkspc/chapter7_final.docx
@@ -164,7 +164,7 @@
                 <w:b/>
                 <w:sz w:val="21"/>
               </w:rPr>
-              <w:t>功能域               模块</w:t>
+              <w:t>功能域</w:t>
             </w:r>
           </w:p>
         </w:tc>
@@ -184,7 +184,7 @@
                 <w:b/>
                 <w:sz w:val="21"/>
               </w:rPr>
-              <w:t>称             监测/管理对</w:t>
+              <w:t>模块名称</w:t>
             </w:r>
           </w:p>
         </w:tc>
@@ -204,6 +204,7 @@
                 <w:b/>
                 <w:sz w:val="21"/>
               </w:rPr>
+              <w:t>监测/管理对象</w:t>
             </w:r>
           </w:p>
         </w:tc>
@@ -224,7 +225,26 @@
                 <w:b w:val="0"/>
                 <w:sz w:val="21"/>
               </w:rPr>
-              <w:t>与结构安全监测   地表沉降监测</w:t>
+              <w:t>变形与结构安全监测</w:t>
+            </w:r>
+          </w:p>
+        </w:tc>
+        <w:tc>
+          <w:tcPr>
+            <w:tcW w:type="dxa" w:w="2929"/>
+          </w:tcPr>
+          <w:p>
+            <w:pPr>
+              <w:spacing w:before="0" w:after="0" w:line="320" w:lineRule="exact"/>
+            </w:pPr>
+            <w:r/>
+            <w:r>
+              <w:rPr>
+                <w:rFonts w:ascii="Times New Roman" w:hAnsi="Times New Roman" w:eastAsia="宋体"/>
+                <w:b w:val="0"/>
+                <w:sz w:val="21"/>
+              </w:rPr>
+              <w:t>地表沉降监测</w:t>
             </w:r>
           </w:p>
         </w:tc>
@@ -247,6 +267,8 @@
             </w:r>
           </w:p>
         </w:tc>
+      </w:tr>
+      <w:tr>
         <w:tc>
           <w:tcPr>
             <w:tcW w:type="dxa" w:w="2929"/>
@@ -262,6 +284,44 @@
                 <w:b w:val="0"/>
                 <w:sz w:val="21"/>
               </w:rPr>
+            </w:r>
+          </w:p>
+        </w:tc>
+        <w:tc>
+          <w:tcPr>
+            <w:tcW w:type="dxa" w:w="2929"/>
+          </w:tcPr>
+          <w:p>
+            <w:pPr>
+              <w:spacing w:before="0" w:after="0" w:line="320" w:lineRule="exact"/>
+            </w:pPr>
+            <w:r/>
+            <w:r>
+              <w:rPr>
+                <w:rFonts w:ascii="Times New Roman" w:hAnsi="Times New Roman" w:eastAsia="宋体"/>
+                <w:b w:val="0"/>
+                <w:sz w:val="21"/>
+              </w:rPr>
+              <w:t>围岩裂缝监测</w:t>
+            </w:r>
+          </w:p>
+        </w:tc>
+        <w:tc>
+          <w:tcPr>
+            <w:tcW w:type="dxa" w:w="2929"/>
+          </w:tcPr>
+          <w:p>
+            <w:pPr>
+              <w:spacing w:before="0" w:after="0" w:line="320" w:lineRule="exact"/>
+            </w:pPr>
+            <w:r/>
+            <w:r>
+              <w:rPr>
+                <w:rFonts w:ascii="Times New Roman" w:hAnsi="Times New Roman" w:eastAsia="宋体"/>
+                <w:b w:val="0"/>
+                <w:sz w:val="21"/>
+              </w:rPr>
+              <w:t>隧道衬砌及周边结构裂缝宽度与发展趋势</w:t>
             </w:r>
           </w:p>
         </w:tc>
@@ -282,7 +342,6 @@
                 <w:b w:val="0"/>
                 <w:sz w:val="21"/>
               </w:rPr>
-              <w:t>裂缝监测         隧道衬砌及周边</w:t>
             </w:r>
           </w:p>
         </w:tc>
@@ -301,7 +360,7 @@
                 <w:b w:val="0"/>
                 <w:sz w:val="21"/>
               </w:rPr>
-              <w:t>构裂缝宽度与发展趋势</w:t>
+              <w:t>钢筋应力监测</w:t>
             </w:r>
           </w:p>
         </w:tc>
@@ -320,6 +379,7 @@
                 <w:b w:val="0"/>
                 <w:sz w:val="21"/>
               </w:rPr>
+              <w:t>支护结构钢筋受力状态</w:t>
             </w:r>
           </w:p>
         </w:tc>
@@ -340,7 +400,6 @@
                 <w:b w:val="0"/>
                 <w:sz w:val="21"/>
               </w:rPr>
-              <w:t>应力监测         支护结构钢筋受</w:t>
             </w:r>
           </w:p>
         </w:tc>
@@ -359,7 +418,7 @@
                 <w:b w:val="0"/>
                 <w:sz w:val="21"/>
               </w:rPr>
-              <w:t>状态</w:t>
+              <w:t>InSAR地表形变</w:t>
             </w:r>
           </w:p>
         </w:tc>
@@ -378,6 +437,7 @@
                 <w:b w:val="0"/>
                 <w:sz w:val="21"/>
               </w:rPr>
+              <w:t>卫星遥感覆盖区域的大范围地表沉降</w:t>
             </w:r>
           </w:p>
         </w:tc>
@@ -398,7 +458,7 @@
                 <w:b w:val="0"/>
                 <w:sz w:val="21"/>
               </w:rPr>
-              <w:t>SAR地表形变        卫星遥感覆</w:t>
+              <w:t>施工环境监测</w:t>
             </w:r>
           </w:p>
         </w:tc>
@@ -417,7 +477,7 @@
                 <w:b w:val="0"/>
                 <w:sz w:val="21"/>
               </w:rPr>
-              <w:t>区域的大范围地表沉降</w:t>
+              <w:t>温湿度采集</w:t>
             </w:r>
           </w:p>
         </w:tc>
@@ -436,6 +496,7 @@
                 <w:b w:val="0"/>
                 <w:sz w:val="21"/>
               </w:rPr>
+              <w:t>隧道洞内温度、湿度等环境参数</w:t>
             </w:r>
           </w:p>
         </w:tc>
@@ -456,7 +517,6 @@
                 <w:b w:val="0"/>
                 <w:sz w:val="21"/>
               </w:rPr>
-              <w:t>环境监测         温湿度采集</w:t>
             </w:r>
           </w:p>
         </w:tc>
@@ -475,7 +535,7 @@
                 <w:b w:val="0"/>
                 <w:sz w:val="21"/>
               </w:rPr>
-              <w:t>隧道洞内温度、湿度等环境</w:t>
+              <w:t>振动监测</w:t>
             </w:r>
           </w:p>
         </w:tc>
@@ -494,7 +554,7 @@
                 <w:b w:val="0"/>
                 <w:sz w:val="21"/>
               </w:rPr>
-              <w:t>数</w:t>
+              <w:t>爆破施工引起的周边建构筑物振动响应</w:t>
             </w:r>
           </w:p>
         </w:tc>
@@ -515,7 +575,7 @@
                 <w:b w:val="0"/>
                 <w:sz w:val="21"/>
               </w:rPr>
-              <w:t>监测             爆破施工引</w:t>
+              <w:t>施工过程管控</w:t>
             </w:r>
           </w:p>
         </w:tc>
@@ -534,7 +594,7 @@
                 <w:b w:val="0"/>
                 <w:sz w:val="21"/>
               </w:rPr>
-              <w:t>的周边建构筑物振动响应</w:t>
+              <w:t>盾构轨迹追踪</w:t>
             </w:r>
           </w:p>
         </w:tc>
@@ -553,6 +613,7 @@
                 <w:b w:val="0"/>
                 <w:sz w:val="21"/>
               </w:rPr>
+              <w:t>盾构机掘进姿态、环级偏差与轴线控制</w:t>
             </w:r>
           </w:p>
         </w:tc>
@@ -573,7 +634,6 @@
                 <w:b w:val="0"/>
                 <w:sz w:val="21"/>
               </w:rPr>
-              <w:t>过程管控         盾构轨迹追踪</w:t>
             </w:r>
           </w:p>
         </w:tc>
@@ -592,7 +652,7 @@
                 <w:b w:val="0"/>
                 <w:sz w:val="21"/>
               </w:rPr>
-              <w:t>盾构机掘进姿态、环级偏差与</w:t>
+              <w:t>工单管理</w:t>
             </w:r>
           </w:p>
         </w:tc>
@@ -611,7 +671,7 @@
                 <w:b w:val="0"/>
                 <w:sz w:val="21"/>
               </w:rPr>
-              <w:t>线控制</w:t>
+              <w:t>现场问题上报、分派、处理与闭环跟踪</w:t>
             </w:r>
           </w:p>
         </w:tc>
@@ -632,7 +692,6 @@
                 <w:b w:val="0"/>
                 <w:sz w:val="21"/>
               </w:rPr>
-              <w:t>管理             现场问题上</w:t>
             </w:r>
           </w:p>
         </w:tc>
@@ -651,7 +710,7 @@
                 <w:b w:val="0"/>
                 <w:sz w:val="21"/>
               </w:rPr>
-              <w:t>、分派、处理与闭环跟踪</w:t>
+              <w:t>隧道断面管理</w:t>
             </w:r>
           </w:p>
         </w:tc>
@@ -670,6 +729,7 @@
                 <w:b w:val="0"/>
                 <w:sz w:val="21"/>
               </w:rPr>
+              <w:t>各施工断面风险等级评估与汇总</w:t>
             </w:r>
           </w:p>
         </w:tc>
@@ -690,7 +750,6 @@
                 <w:b w:val="0"/>
                 <w:sz w:val="21"/>
               </w:rPr>
-              <w:t>断面管理         各施工断面风险</w:t>
             </w:r>
           </w:p>
         </w:tc>
@@ -709,7 +768,7 @@
                 <w:b w:val="0"/>
                 <w:sz w:val="21"/>
               </w:rPr>
-              <w:t>级评估与汇总</w:t>
+              <w:t>数据批量导入</w:t>
             </w:r>
           </w:p>
         </w:tc>
@@ -728,6 +787,7 @@
                 <w:b w:val="0"/>
                 <w:sz w:val="21"/>
               </w:rPr>
+              <w:t>Excel/MDB/CSV等多格式监测数据入库</w:t>
             </w:r>
           </w:p>
         </w:tc>
@@ -748,7 +808,7 @@
                 <w:b w:val="0"/>
                 <w:sz w:val="21"/>
               </w:rPr>
-              <w:t>批量导入         Excel/M</w:t>
+              <w:t>智能分析与决策</w:t>
             </w:r>
           </w:p>
         </w:tc>
@@ -767,7 +827,7 @@
                 <w:b w:val="0"/>
                 <w:sz w:val="21"/>
               </w:rPr>
-              <w:t>B/CSV等多格式监测数据入库</w:t>
+              <w:t>沉降预测分析</w:t>
             </w:r>
           </w:p>
         </w:tc>
@@ -786,6 +846,7 @@
                 <w:b w:val="0"/>
                 <w:sz w:val="21"/>
               </w:rPr>
+              <w:t>基于机器学习的地表沉降趋势预判</w:t>
             </w:r>
           </w:p>
         </w:tc>
@@ -806,7 +867,6 @@
                 <w:b w:val="0"/>
                 <w:sz w:val="21"/>
               </w:rPr>
-              <w:t>分析与决策       沉降预测分析</w:t>
             </w:r>
           </w:p>
         </w:tc>
@@ -825,7 +885,7 @@
                 <w:b w:val="0"/>
                 <w:sz w:val="21"/>
               </w:rPr>
-              <w:t>基于机器学习的地表沉降趋势预</w:t>
+              <w:t>异常检测</w:t>
             </w:r>
           </w:p>
         </w:tc>
@@ -844,6 +904,7 @@
                 <w:b w:val="0"/>
                 <w:sz w:val="21"/>
               </w:rPr>
+              <w:t>多指标联合异常识别与预警</w:t>
             </w:r>
           </w:p>
         </w:tc>
@@ -864,7 +925,6 @@
                 <w:b w:val="0"/>
                 <w:sz w:val="21"/>
               </w:rPr>
-              <w:t>检测             多指标联合</w:t>
             </w:r>
           </w:p>
         </w:tc>
@@ -883,7 +943,7 @@
                 <w:b w:val="0"/>
                 <w:sz w:val="21"/>
               </w:rPr>
-              <w:t>常识别与预警</w:t>
+              <w:t>高级统计分析</w:t>
             </w:r>
           </w:p>
         </w:tc>
@@ -902,6 +962,7 @@
                 <w:b w:val="0"/>
                 <w:sz w:val="21"/>
               </w:rPr>
+              <w:t>因果推断、空间关联等深度分析</w:t>
             </w:r>
           </w:p>
         </w:tc>
@@ -922,7 +983,6 @@
                 <w:b w:val="0"/>
                 <w:sz w:val="21"/>
               </w:rPr>
-              <w:t>统计分析         因果推断、空间</w:t>
             </w:r>
           </w:p>
         </w:tc>
@@ -941,7 +1001,7 @@
                 <w:b w:val="0"/>
                 <w:sz w:val="21"/>
               </w:rPr>
-              <w:t>联等深度分析</w:t>
+              <w:t>AI智能助手</w:t>
             </w:r>
           </w:p>
         </w:tc>
@@ -960,6 +1020,7 @@
                 <w:b w:val="0"/>
                 <w:sz w:val="21"/>
               </w:rPr>
+              <w:t>自然语言交互式监测数据查询与决策辅助</w:t>
             </w:r>
           </w:p>
         </w:tc>
@@ -980,7 +1041,6 @@
                 <w:b w:val="0"/>
                 <w:sz w:val="21"/>
               </w:rPr>
-              <w:t>智能助手           自然语言交</w:t>
             </w:r>
           </w:p>
         </w:tc>
@@ -999,7 +1059,7 @@
                 <w:b w:val="0"/>
                 <w:sz w:val="21"/>
               </w:rPr>
-              <w:t>式监测数据查询与决策辅助</w:t>
+              <w:t>总览仪表盘</w:t>
             </w:r>
           </w:p>
         </w:tc>
@@ -1018,122 +1078,7 @@
                 <w:b w:val="0"/>
                 <w:sz w:val="21"/>
               </w:rPr>
-            </w:r>
-          </w:p>
-        </w:tc>
-      </w:tr>
-      <w:tr>
-        <w:tc>
-          <w:tcPr>
-            <w:tcW w:type="dxa" w:w="2929"/>
-          </w:tcPr>
-          <w:p>
-            <w:pPr>
-              <w:spacing w:before="0" w:after="0" w:line="320" w:lineRule="exact"/>
-            </w:pPr>
-            <w:r/>
-            <w:r>
-              <w:rPr>
-                <w:rFonts w:ascii="Times New Roman" w:hAnsi="Times New Roman" w:eastAsia="宋体"/>
-                <w:b w:val="0"/>
-                <w:sz w:val="21"/>
-              </w:rPr>
-              <w:t>仪表盘           全线监测态势</w:t>
-            </w:r>
-          </w:p>
-        </w:tc>
-        <w:tc>
-          <w:tcPr>
-            <w:tcW w:type="dxa" w:w="2929"/>
-          </w:tcPr>
-          <w:p>
-            <w:pPr>
-              <w:spacing w:before="0" w:after="0" w:line="320" w:lineRule="exact"/>
-            </w:pPr>
-            <w:r/>
-            <w:r>
-              <w:rPr>
-                <w:rFonts w:ascii="Times New Roman" w:hAnsi="Times New Roman" w:eastAsia="宋体"/>
-                <w:b w:val="0"/>
-                <w:sz w:val="21"/>
-              </w:rPr>
-              <w:t>知与关键指标汇总</w:t>
-            </w:r>
-          </w:p>
-        </w:tc>
-        <w:tc>
-          <w:tcPr>
-            <w:tcW w:type="dxa" w:w="2929"/>
-          </w:tcPr>
-          <w:p>
-            <w:pPr>
-              <w:spacing w:before="0" w:after="0" w:line="320" w:lineRule="exact"/>
-            </w:pPr>
-            <w:r/>
-            <w:r>
-              <w:rPr>
-                <w:rFonts w:ascii="Times New Roman" w:hAnsi="Times New Roman" w:eastAsia="宋体"/>
-                <w:b w:val="0"/>
-                <w:sz w:val="21"/>
-              </w:rPr>
-            </w:r>
-          </w:p>
-        </w:tc>
-      </w:tr>
-      <w:tr>
-        <w:tc>
-          <w:tcPr>
-            <w:tcW w:type="dxa" w:w="2929"/>
-          </w:tcPr>
-          <w:p>
-            <w:pPr>
-              <w:spacing w:before="0" w:after="0" w:line="320" w:lineRule="exact"/>
-            </w:pPr>
-            <w:r/>
-            <w:r>
-              <w:rPr>
-                <w:rFonts w:ascii="Times New Roman" w:hAnsi="Times New Roman" w:eastAsia="宋体"/>
-                <w:b w:val="0"/>
-                <w:sz w:val="21"/>
-              </w:rPr>
-              <w:t>仪表盘           全线监测态势</w:t>
-            </w:r>
-          </w:p>
-        </w:tc>
-        <w:tc>
-          <w:tcPr>
-            <w:tcW w:type="dxa" w:w="2929"/>
-          </w:tcPr>
-          <w:p>
-            <w:pPr>
-              <w:spacing w:before="0" w:after="0" w:line="320" w:lineRule="exact"/>
-            </w:pPr>
-            <w:r/>
-            <w:r>
-              <w:rPr>
-                <w:rFonts w:ascii="Times New Roman" w:hAnsi="Times New Roman" w:eastAsia="宋体"/>
-                <w:b w:val="0"/>
-                <w:sz w:val="21"/>
-              </w:rPr>
-              <w:t>知与关键指标汇总</w:t>
-            </w:r>
-          </w:p>
-        </w:tc>
-        <w:tc>
-          <w:tcPr>
-            <w:tcW w:type="dxa" w:w="2929"/>
-          </w:tcPr>
-          <w:p>
-            <w:pPr>
-              <w:spacing w:before="0" w:after="0" w:line="320" w:lineRule="exact"/>
-            </w:pPr>
-            <w:r/>
-            <w:r>
-              <w:rPr>
-                <w:rFonts w:ascii="Times New Roman" w:hAnsi="Times New Roman" w:eastAsia="宋体"/>
-                <w:b w:val="0"/>
-                <w:sz w:val="21"/>
-              </w:rPr>
+              <w:t>全线监测态势感知与关键指标汇总</w:t>
             </w:r>
           </w:p>
         </w:tc>
@@ -1150,63 +1095,7 @@
           <w:b w:val="0"/>
           <w:sz w:val="24"/>
         </w:rPr>
-        <w:t>系统总体架构采用表现层、业务逻辑层和数据持久层的三层结构，如图7-1所示。表现层面向隧道施工现场的工程师、项目管理人员和数据分析人员，使用React和TypeScript构建单页应用（Single</w:t>
-      </w:r>
-    </w:p>
-    <w:p>
-      <w:pPr>
-        <w:ind w:firstLineChars="200"/>
-        <w:spacing w:before="0" w:after="0" w:line="440" w:lineRule="exact"/>
-      </w:pPr>
-      <w:r>
-        <w:rPr>
-          <w:rFonts w:ascii="Times New Roman" w:hAnsi="Times New Roman" w:eastAsia="宋体"/>
-          <w:b w:val="0"/>
-          <w:sz w:val="24"/>
-        </w:rPr>
-        <w:t>Page</w:t>
-      </w:r>
-    </w:p>
-    <w:p>
-      <w:pPr>
-        <w:ind w:firstLineChars="200"/>
-        <w:spacing w:before="0" w:after="0" w:line="440" w:lineRule="exact"/>
-      </w:pPr>
-      <w:r>
-        <w:rPr>
-          <w:rFonts w:ascii="Times New Roman" w:hAnsi="Times New Roman" w:eastAsia="宋体"/>
-          <w:b w:val="0"/>
-          <w:sz w:val="24"/>
-        </w:rPr>
-        <w:t>Application，简称SPA），为上述15个功能模块分别设计了对应的操作界面，并采用懒加载策略——仅在用户访问特定监测功能时才加载对应页面，从而有效控制系统的初始加载时间。业务逻辑层基于Flask搭建，将15个功能模块各自注册为独立的服务单元，每个模块拥有独立的数据处理与接口逻辑，便于针对不同监测业务进行并行开发与独立维护。数据持久层的设计充分考虑了隧道项目的部署场景多样性：云端部署阶段使用Supabase托管的PostgreSQL数据库，通过REST应用程序接口（Application</w:t>
-      </w:r>
-    </w:p>
-    <w:p>
-      <w:pPr>
-        <w:ind w:firstLineChars="200"/>
-        <w:spacing w:before="0" w:after="0" w:line="440" w:lineRule="exact"/>
-      </w:pPr>
-      <w:r>
-        <w:rPr>
-          <w:rFonts w:ascii="Times New Roman" w:hAnsi="Times New Roman" w:eastAsia="宋体"/>
-          <w:b w:val="0"/>
-          <w:sz w:val="24"/>
-        </w:rPr>
-        <w:t>Programming</w:t>
-      </w:r>
-    </w:p>
-    <w:p>
-      <w:pPr>
-        <w:ind w:firstLineChars="200"/>
-        <w:spacing w:before="0" w:after="0" w:line="440" w:lineRule="exact"/>
-      </w:pPr>
-      <w:r>
-        <w:rPr>
-          <w:rFonts w:ascii="Times New Roman" w:hAnsi="Times New Roman" w:eastAsia="宋体"/>
-          <w:b w:val="0"/>
-          <w:sz w:val="24"/>
-        </w:rPr>
-        <w:t>Interface，简称API）进行访问；而企业内网或施工现场离线环境下，可通过配置切换至MySQL数据库，两种数据源对上层业务完全透明，切换时无需修改任何业务代码。</w:t>
+        <w:t>系统总体架构采用表现层、业务逻辑层和数据持久层的三层结构，如图7-1所示。表现层面向隧道施工现场的工程师、项目管理人员和数据分析人员，使用React和TypeScript构建单页应用（SinglePageApplication，简称SPA），为上述15个功能模块分别设计了对应的操作界面，并采用懒加载策略——仅在用户访问特定监测功能时才加载对应页面，从而有效控制系统的初始加载时间。业务逻辑层基于Flask搭建，将15个功能模块各自注册为独立的服务单元，每个模块拥有独立的数据处理与接口逻辑，便于针对不同监测业务进行并行开发与独立维护。数据持久层的设计充分考虑了隧道项目的部署场景多样性：云端部署阶段使用Supabase托管的PostgreSQL数据库，通过REST应用程序接口（ApplicationProgrammingInterface，简称API）进行访问；而企业内网或施工现场离线环境下，可通过配置切换至MySQL数据库，两种数据源对上层业务完全透明，切换时无需修改任何业务代码。</w:t>
       </w:r>
     </w:p>
     <w:p>
@@ -1234,21 +1123,7 @@
           <w:b w:val="0"/>
           <w:sz w:val="24"/>
         </w:rPr>
-        <w:t>系统的技术选型以隧道工程监测场景的实际需求为导向。界面开发方面，选择React框架的组件化开发模式，使得沉降、裂缝、振动等各监测模块可以作为独立组件分别开发和维护，适合功能模块较多的综合监测平台。后端选择Python语言，主要原因在于隧道监测系统需要集成沉降预测、异常检测、因果推断等多种机器学习（Machine</w:t>
-      </w:r>
-    </w:p>
-    <w:p>
-      <w:pPr>
-        <w:ind w:firstLineChars="200"/>
-        <w:spacing w:before="0" w:after="0" w:line="440" w:lineRule="exact"/>
-      </w:pPr>
-      <w:r>
-        <w:rPr>
-          <w:rFonts w:ascii="Times New Roman" w:hAnsi="Times New Roman" w:eastAsia="宋体"/>
-          <w:b w:val="0"/>
-          <w:sz w:val="24"/>
-        </w:rPr>
-        <w:t>Learning，简称ML）模型，Python在科学计算与机器学习领域具有最为成熟的工具链支持，便于将数据分析算法与监测业务服务进行集成。数据可视化方面，针对隧道监测数据的时序特征和空间分布特点，系统集成了三类可视化引擎：（1）ECharts图表库用于绘制沉降曲线、温度场分布和振动频谱等时序监测图表；（2）Leaflet地图引擎用于InSAR卫星遥感地表形变和隧道线路走向的空间展示；（3）Three.js三维引擎用于隧道结构的数字孪生可视化，支持工程师从三维视角观察隧道线型与变形情况。各类技术选型及其在系统中的具体用途详见表7-1。</w:t>
+        <w:t>系统的技术选型以隧道工程监测场景的实际需求为导向。界面开发方面，选择React框架的组件化开发模式，使得沉降、裂缝、振动等各监测模块可以作为独立组件分别开发和维护，适合功能模块较多的综合监测平台。后端选择Python语言，主要原因在于隧道监测系统需要集成沉降预测、异常检测、因果推断等多种机器学习（MachineLearning，简称ML）模型，Python在科学计算与机器学习领域具有最为成熟的工具链支持，便于将数据分析算法与监测业务服务进行集成。数据可视化方面，针对隧道监测数据的时序特征和空间分布特点，系统集成了三类可视化引擎：（1）ECharts图表库用于绘制沉降曲线、温度场分布和振动频谱等时序监测图表；（2）Leaflet地图引擎用于InSAR卫星遥感地表形变和隧道线路走向的空间展示；（3）Three.js三维引擎用于隧道结构的数字孪生可视化，支持工程师从三维视角观察隧道线型与变形情况。各类技术选型及其在系统中的具体用途详见表7-1。</w:t>
       </w:r>
     </w:p>
     <w:p>
@@ -1293,7 +1168,7 @@
                 <w:b/>
                 <w:sz w:val="21"/>
               </w:rPr>
-              <w:t>技术/</w:t>
+              <w:t>类别</w:t>
             </w:r>
           </w:p>
         </w:tc>
@@ -1313,7 +1188,7 @@
                 <w:b/>
                 <w:sz w:val="21"/>
               </w:rPr>
-              <w:t>具            用途说明</w:t>
+              <w:t>技术/工具</w:t>
             </w:r>
           </w:p>
         </w:tc>
@@ -1333,6 +1208,7 @@
                 <w:b/>
                 <w:sz w:val="21"/>
               </w:rPr>
+              <w:t>用途说明</w:t>
             </w:r>
           </w:p>
         </w:tc>
@@ -1353,7 +1229,7 @@
                 <w:b w:val="0"/>
                 <w:sz w:val="21"/>
               </w:rPr>
-              <w:t>前端框架             Rea</w:t>
+              <w:t>前端框架</w:t>
             </w:r>
           </w:p>
         </w:tc>
@@ -1372,7 +1248,7 @@
                 <w:b w:val="0"/>
                 <w:sz w:val="21"/>
               </w:rPr>
-              <w:t>t 18 +           组件化 TypeScript</w:t>
+              <w:t>React 18 + TypeScript</w:t>
             </w:r>
           </w:p>
         </w:tc>
@@ -1391,7 +1267,7 @@
                 <w:b w:val="0"/>
                 <w:sz w:val="21"/>
               </w:rPr>
-              <w:t>测界面构建与类型安全开发</w:t>
+              <w:t>组件化监测界面构建与类型安全开发</w:t>
             </w:r>
           </w:p>
         </w:tc>
@@ -1412,7 +1288,7 @@
                 <w:b w:val="0"/>
                 <w:sz w:val="21"/>
               </w:rPr>
-              <w:t>构建工具             Vit</w:t>
+              <w:t>构建工具</w:t>
             </w:r>
           </w:p>
         </w:tc>
@@ -1431,7 +1307,7 @@
                 <w:b w:val="0"/>
                 <w:sz w:val="21"/>
               </w:rPr>
-              <w:t>开发热</w:t>
+              <w:t>Vite</w:t>
             </w:r>
           </w:p>
         </w:tc>
@@ -1450,7 +1326,7 @@
                 <w:b w:val="0"/>
                 <w:sz w:val="21"/>
               </w:rPr>
-              <w:t>新与生产环境打包</w:t>
+              <w:t>开发热更新与生产环境打包</w:t>
             </w:r>
           </w:p>
         </w:tc>
@@ -1471,7 +1347,7 @@
                 <w:b w:val="0"/>
                 <w:sz w:val="21"/>
               </w:rPr>
-              <w:t>UI样式               T</w:t>
+              <w:t>UI样式</w:t>
             </w:r>
           </w:p>
         </w:tc>
@@ -1490,7 +1366,7 @@
                 <w:b w:val="0"/>
                 <w:sz w:val="21"/>
               </w:rPr>
-              <w:t>ilwind CSS         响</w:t>
+              <w:t>Tailwind CSS</w:t>
             </w:r>
           </w:p>
         </w:tc>
@@ -1509,7 +1385,7 @@
                 <w:b w:val="0"/>
                 <w:sz w:val="21"/>
               </w:rPr>
-              <w:t>式布局与多端适配</w:t>
+              <w:t>响应式布局与多端适配</w:t>
             </w:r>
           </w:p>
         </w:tc>
@@ -1530,7 +1406,7 @@
                 <w:b w:val="0"/>
                 <w:sz w:val="21"/>
               </w:rPr>
-              <w:t>后端框架             Fla</w:t>
+              <w:t>后端框架</w:t>
             </w:r>
           </w:p>
         </w:tc>
@@ -1549,7 +1425,7 @@
                 <w:b w:val="0"/>
                 <w:sz w:val="21"/>
               </w:rPr>
-              <w:t>k (Python)       RES</w:t>
+              <w:t>Flask (Python)</w:t>
             </w:r>
           </w:p>
         </w:tc>
@@ -1568,7 +1444,7 @@
                 <w:b w:val="0"/>
                 <w:sz w:val="21"/>
               </w:rPr>
-              <w:t>ful API服务与ML模型集成</w:t>
+              <w:t>RESTful API服务与ML模型集成</w:t>
             </w:r>
           </w:p>
         </w:tc>
@@ -1589,7 +1465,7 @@
                 <w:b w:val="0"/>
                 <w:sz w:val="21"/>
               </w:rPr>
-              <w:t>科学计算             Num</w:t>
+              <w:t>科学计算</w:t>
             </w:r>
           </w:p>
         </w:tc>
@@ -1608,7 +1484,7 @@
                 <w:b w:val="0"/>
                 <w:sz w:val="21"/>
               </w:rPr>
-              <w:t>y, SciPy, Pandas 监测数</w:t>
+              <w:t>NumPy, SciPy, Pandas</w:t>
             </w:r>
           </w:p>
         </w:tc>
@@ -1627,7 +1503,7 @@
                 <w:b w:val="0"/>
                 <w:sz w:val="21"/>
               </w:rPr>
-              <w:t>预处理与统计分析</w:t>
+              <w:t>监测数据预处理与统计分析</w:t>
             </w:r>
           </w:p>
         </w:tc>
@@ -1648,7 +1524,7 @@
                 <w:b w:val="0"/>
                 <w:sz w:val="21"/>
               </w:rPr>
-              <w:t>机器学习             Sci</w:t>
+              <w:t>机器学习</w:t>
             </w:r>
           </w:p>
         </w:tc>
@@ -1667,7 +1543,7 @@
                 <w:b w:val="0"/>
                 <w:sz w:val="21"/>
               </w:rPr>
-              <w:t>it-learn,        沉降预 PyTorch</w:t>
+              <w:t>Scikit-learn, PyTorch</w:t>
             </w:r>
           </w:p>
         </w:tc>
@@ -1686,7 +1562,7 @@
                 <w:b w:val="0"/>
                 <w:sz w:val="21"/>
               </w:rPr>
-              <w:t>、异常检测等智能分析</w:t>
+              <w:t>沉降预测、异常检测等智能分析</w:t>
             </w:r>
           </w:p>
         </w:tc>
@@ -1707,7 +1583,7 @@
                 <w:b w:val="0"/>
                 <w:sz w:val="21"/>
               </w:rPr>
-              <w:t>云端数据库           Supa</w:t>
+              <w:t>云端数据库</w:t>
             </w:r>
           </w:p>
         </w:tc>
@@ -1726,7 +1602,7 @@
                 <w:b w:val="0"/>
                 <w:sz w:val="21"/>
               </w:rPr>
-              <w:t>ase             云端监测 (PostgreSQL)</w:t>
+              <w:t>Supabase (PostgreSQL)</w:t>
             </w:r>
           </w:p>
         </w:tc>
@@ -1745,7 +1621,7 @@
                 <w:b w:val="0"/>
                 <w:sz w:val="21"/>
               </w:rPr>
-              <w:t>据持久化存储</w:t>
+              <w:t>云端监测数据持久化存储</w:t>
             </w:r>
           </w:p>
         </w:tc>
@@ -1766,7 +1642,7 @@
                 <w:b w:val="0"/>
                 <w:sz w:val="21"/>
               </w:rPr>
-              <w:t>本地数据库           MySQ</w:t>
+              <w:t>本地数据库</w:t>
             </w:r>
           </w:p>
         </w:tc>
@@ -1785,7 +1661,7 @@
                 <w:b w:val="0"/>
                 <w:sz w:val="21"/>
               </w:rPr>
-              <w:t>施工现场</w:t>
+              <w:t>MySQL</w:t>
             </w:r>
           </w:p>
         </w:tc>
@@ -1804,7 +1680,7 @@
                 <w:b w:val="0"/>
                 <w:sz w:val="21"/>
               </w:rPr>
-              <w:t>线数据存储</w:t>
+              <w:t>施工现场离线数据存储</w:t>
             </w:r>
           </w:p>
         </w:tc>
@@ -1825,7 +1701,7 @@
                 <w:b w:val="0"/>
                 <w:sz w:val="21"/>
               </w:rPr>
-              <w:t>部署平台             Ver</w:t>
+              <w:t>部署平台</w:t>
             </w:r>
           </w:p>
         </w:tc>
@@ -1844,7 +1720,7 @@
                 <w:b w:val="0"/>
                 <w:sz w:val="21"/>
               </w:rPr>
-              <w:t>el Serverless    无服务</w:t>
+              <w:t>Vercel Serverless</w:t>
             </w:r>
           </w:p>
         </w:tc>
@@ -1863,7 +1739,7 @@
                 <w:b w:val="0"/>
                 <w:sz w:val="21"/>
               </w:rPr>
-              <w:t>云端部署</w:t>
+              <w:t>无服务器云端部署</w:t>
             </w:r>
           </w:p>
         </w:tc>
@@ -1884,7 +1760,7 @@
                 <w:b w:val="0"/>
                 <w:sz w:val="21"/>
               </w:rPr>
-              <w:t>移动端               Ca</w:t>
+              <w:t>移动端</w:t>
             </w:r>
           </w:p>
         </w:tc>
@@ -1903,7 +1779,7 @@
                 <w:b w:val="0"/>
                 <w:sz w:val="21"/>
               </w:rPr>
-              <w:t>acitor            An</w:t>
+              <w:t>Capacitor</w:t>
             </w:r>
           </w:p>
         </w:tc>
@@ -1922,7 +1798,7 @@
                 <w:b w:val="0"/>
                 <w:sz w:val="21"/>
               </w:rPr>
-              <w:t>roid移动巡检应用封装</w:t>
+              <w:t>Android移动巡检应用封装</w:t>
             </w:r>
           </w:p>
         </w:tc>
@@ -1943,7 +1819,7 @@
                 <w:b w:val="0"/>
                 <w:sz w:val="21"/>
               </w:rPr>
-              <w:t>图表引擎             ECh</w:t>
+              <w:t>图表引擎</w:t>
             </w:r>
           </w:p>
         </w:tc>
@@ -1962,7 +1838,7 @@
                 <w:b w:val="0"/>
                 <w:sz w:val="21"/>
               </w:rPr>
-              <w:t>rts              沉降曲</w:t>
+              <w:t>ECharts</w:t>
             </w:r>
           </w:p>
         </w:tc>
@@ -1981,7 +1857,7 @@
                 <w:b w:val="0"/>
                 <w:sz w:val="21"/>
               </w:rPr>
-              <w:t>、温度场等监测图表</w:t>
+              <w:t>沉降曲线、温度场等监测图表</w:t>
             </w:r>
           </w:p>
         </w:tc>
@@ -2002,7 +1878,7 @@
                 <w:b w:val="0"/>
                 <w:sz w:val="21"/>
               </w:rPr>
-              <w:t>地图引擎             Lea</w:t>
+              <w:t>地图引擎</w:t>
             </w:r>
           </w:p>
         </w:tc>
@@ -2021,7 +1897,7 @@
                 <w:b w:val="0"/>
                 <w:sz w:val="21"/>
               </w:rPr>
-              <w:t>let              InS</w:t>
+              <w:t>Leaflet</w:t>
             </w:r>
           </w:p>
         </w:tc>
@@ -2040,7 +1916,7 @@
                 <w:b w:val="0"/>
                 <w:sz w:val="21"/>
               </w:rPr>
-              <w:t>R形变与隧道线路空间展示</w:t>
+              <w:t>InSAR形变与隧道线路空间展示</w:t>
             </w:r>
           </w:p>
         </w:tc>
@@ -2061,7 +1937,7 @@
                 <w:b w:val="0"/>
                 <w:sz w:val="21"/>
               </w:rPr>
-              <w:t>3D引擎               T</w:t>
+              <w:t>3D引擎</w:t>
             </w:r>
           </w:p>
         </w:tc>
@@ -2080,7 +1956,7 @@
                 <w:b w:val="0"/>
                 <w:sz w:val="21"/>
               </w:rPr>
-              <w:t>ree.js             隧</w:t>
+              <w:t>Three.js</w:t>
             </w:r>
           </w:p>
         </w:tc>
@@ -2099,66 +1975,7 @@
                 <w:b w:val="0"/>
                 <w:sz w:val="21"/>
               </w:rPr>
-              <w:t>结构三维数字孪生可视化</w:t>
-            </w:r>
-          </w:p>
-        </w:tc>
-      </w:tr>
-      <w:tr>
-        <w:tc>
-          <w:tcPr>
-            <w:tcW w:type="dxa" w:w="2929"/>
-          </w:tcPr>
-          <w:p>
-            <w:pPr>
-              <w:spacing w:before="0" w:after="0" w:line="320" w:lineRule="exact"/>
-            </w:pPr>
-            <w:r/>
-            <w:r>
-              <w:rPr>
-                <w:rFonts w:ascii="Times New Roman" w:hAnsi="Times New Roman" w:eastAsia="宋体"/>
-                <w:b w:val="0"/>
-                <w:sz w:val="21"/>
-              </w:rPr>
-              <w:t>3D引擎               T</w:t>
-            </w:r>
-          </w:p>
-        </w:tc>
-        <w:tc>
-          <w:tcPr>
-            <w:tcW w:type="dxa" w:w="2929"/>
-          </w:tcPr>
-          <w:p>
-            <w:pPr>
-              <w:spacing w:before="0" w:after="0" w:line="320" w:lineRule="exact"/>
-            </w:pPr>
-            <w:r/>
-            <w:r>
-              <w:rPr>
-                <w:rFonts w:ascii="Times New Roman" w:hAnsi="Times New Roman" w:eastAsia="宋体"/>
-                <w:b w:val="0"/>
-                <w:sz w:val="21"/>
-              </w:rPr>
-              <w:t>ree.js             隧</w:t>
-            </w:r>
-          </w:p>
-        </w:tc>
-        <w:tc>
-          <w:tcPr>
-            <w:tcW w:type="dxa" w:w="2929"/>
-          </w:tcPr>
-          <w:p>
-            <w:pPr>
-              <w:spacing w:before="0" w:after="0" w:line="320" w:lineRule="exact"/>
-            </w:pPr>
-            <w:r/>
-            <w:r>
-              <w:rPr>
-                <w:rFonts w:ascii="Times New Roman" w:hAnsi="Times New Roman" w:eastAsia="宋体"/>
-                <w:b w:val="0"/>
-                <w:sz w:val="21"/>
-              </w:rPr>
-              <w:t>结构三维数字孪生可视化</w:t>
+              <w:t>隧道结构三维数字孪生可视化</w:t>
             </w:r>
           </w:p>
         </w:tc>
@@ -2319,7 +2136,27 @@
                 <w:b/>
                 <w:sz w:val="21"/>
               </w:rPr>
-              <w:t>数据类型        文件格</w:t>
+              <w:t>数据类型</w:t>
+            </w:r>
+          </w:p>
+        </w:tc>
+        <w:tc>
+          <w:tcPr>
+            <w:tcW w:type="dxa" w:w="2197"/>
+          </w:tcPr>
+          <w:p>
+            <w:pPr>
+              <w:jc w:val="center"/>
+              <w:spacing w:before="0" w:after="0" w:line="320" w:lineRule="exact"/>
+            </w:pPr>
+            <w:r/>
+            <w:r>
+              <w:rPr>
+                <w:rFonts w:ascii="Times New Roman" w:hAnsi="Times New Roman" w:eastAsia="黑体"/>
+                <w:b/>
+                <w:sz w:val="21"/>
+              </w:rPr>
+              <w:t>文件格式</w:t>
             </w:r>
           </w:p>
         </w:tc>
@@ -2363,22 +2200,81 @@
             </w:r>
           </w:p>
         </w:tc>
+      </w:tr>
+      <w:tr>
         <w:tc>
           <w:tcPr>
             <w:tcW w:type="dxa" w:w="2197"/>
           </w:tcPr>
           <w:p>
             <w:pPr>
-              <w:jc w:val="center"/>
               <w:spacing w:before="0" w:after="0" w:line="320" w:lineRule="exact"/>
             </w:pPr>
             <w:r/>
             <w:r>
               <w:rPr>
-                <w:rFonts w:ascii="Times New Roman" w:hAnsi="Times New Roman" w:eastAsia="黑体"/>
-                <w:b/>
+                <w:rFonts w:ascii="Times New Roman" w:hAnsi="Times New Roman" w:eastAsia="宋体"/>
+                <w:b w:val="0"/>
                 <w:sz w:val="21"/>
               </w:rPr>
+              <w:t>沉降监测</w:t>
+            </w:r>
+          </w:p>
+        </w:tc>
+        <w:tc>
+          <w:tcPr>
+            <w:tcW w:type="dxa" w:w="2197"/>
+          </w:tcPr>
+          <w:p>
+            <w:pPr>
+              <w:spacing w:before="0" w:after="0" w:line="320" w:lineRule="exact"/>
+            </w:pPr>
+            <w:r/>
+            <w:r>
+              <w:rPr>
+                <w:rFonts w:ascii="Times New Roman" w:hAnsi="Times New Roman" w:eastAsia="宋体"/>
+                <w:b w:val="0"/>
+                <w:sz w:val="21"/>
+              </w:rPr>
+              <w:t>Excel (.xlsx/.xls)</w:t>
+            </w:r>
+          </w:p>
+        </w:tc>
+        <w:tc>
+          <w:tcPr>
+            <w:tcW w:type="dxa" w:w="2197"/>
+          </w:tcPr>
+          <w:p>
+            <w:pPr>
+              <w:spacing w:before="0" w:after="0" w:line="320" w:lineRule="exact"/>
+            </w:pPr>
+            <w:r/>
+            <w:r>
+              <w:rPr>
+                <w:rFonts w:ascii="Times New Roman" w:hAnsi="Times New Roman" w:eastAsia="宋体"/>
+                <w:b w:val="0"/>
+                <w:sz w:val="21"/>
+              </w:rPr>
+              <w:t>自动识别测量日期列，按断面解析累计沉降量</w:t>
+            </w:r>
+          </w:p>
+        </w:tc>
+        <w:tc>
+          <w:tcPr>
+            <w:tcW w:type="dxa" w:w="2197"/>
+          </w:tcPr>
+          <w:p>
+            <w:pPr>
+              <w:spacing w:before="0" w:after="0" w:line="320" w:lineRule="exact"/>
+            </w:pPr>
+            <w:r/>
+            <w:r>
+              <w:rPr>
+                <w:rFonts w:ascii="Times New Roman" w:hAnsi="Times New Roman" w:eastAsia="宋体"/>
+                <w:b w:val="0"/>
+                <w:sz w:val="21"/>
+              </w:rPr>
+              <w:t>沉降原始数据表</w:t>
             </w:r>
           </w:p>
         </w:tc>
@@ -2399,7 +2295,7 @@
                 <w:b w:val="0"/>
                 <w:sz w:val="21"/>
               </w:rPr>
-              <w:t>监测        Excel</w:t>
+              <w:t>裂缝监测</w:t>
             </w:r>
           </w:p>
         </w:tc>
@@ -2418,7 +2314,7 @@
                 <w:b w:val="0"/>
                 <w:sz w:val="21"/>
               </w:rPr>
-              <w:t>自动识别测</w:t>
+              <w:t>Excel (.xlsx/.xls)</w:t>
             </w:r>
           </w:p>
         </w:tc>
@@ -2437,7 +2333,7 @@
                 <w:b w:val="0"/>
                 <w:sz w:val="21"/>
               </w:rPr>
-              <w:t>日期列，按断面解析累计沉降量    沉降原始数据表(.xlsx/.xls)</w:t>
+              <w:t>支持测点动态增减，自动过滤统计汇总行</w:t>
             </w:r>
           </w:p>
         </w:tc>
@@ -2456,6 +2352,7 @@
                 <w:b w:val="0"/>
                 <w:sz w:val="21"/>
               </w:rPr>
+              <w:t>裂缝监测数据表</w:t>
             </w:r>
           </w:p>
         </w:tc>
@@ -2476,7 +2373,7 @@
                 <w:b w:val="0"/>
                 <w:sz w:val="21"/>
               </w:rPr>
-              <w:t>监测        Excel</w:t>
+              <w:t>温度监测</w:t>
             </w:r>
           </w:p>
         </w:tc>
@@ -2495,7 +2392,7 @@
                 <w:b w:val="0"/>
                 <w:sz w:val="21"/>
               </w:rPr>
-              <w:t>支持测点动</w:t>
+              <w:t>Access (.mdb/.accdb)</w:t>
             </w:r>
           </w:p>
         </w:tc>
@@ -2514,7 +2411,7 @@
                 <w:b w:val="0"/>
                 <w:sz w:val="21"/>
               </w:rPr>
-              <w:t>增减，自动过滤统计汇总行        裂缝监测数据表(.xlsx/.xls)</w:t>
+              <w:t>按传感器类型筛选温度通道，电阻值-温度换算</w:t>
             </w:r>
           </w:p>
         </w:tc>
@@ -2533,6 +2430,7 @@
                 <w:b w:val="0"/>
                 <w:sz w:val="21"/>
               </w:rPr>
+              <w:t>温度监测数据表</w:t>
             </w:r>
           </w:p>
         </w:tc>
@@ -2553,7 +2451,7 @@
                 <w:b w:val="0"/>
                 <w:sz w:val="21"/>
               </w:rPr>
-              <w:t>监测        Acces</w:t>
+              <w:t>振动监测</w:t>
             </w:r>
           </w:p>
         </w:tc>
@@ -2572,7 +2470,7 @@
                 <w:b w:val="0"/>
                 <w:sz w:val="21"/>
               </w:rPr>
-              <w:t>按传感器类</w:t>
+              <w:t>波形文件/CSV</w:t>
             </w:r>
           </w:p>
         </w:tc>
@@ -2591,7 +2489,7 @@
                 <w:b w:val="0"/>
                 <w:sz w:val="21"/>
               </w:rPr>
-              <w:t>筛选温度通道，电阻值-温度换算   温度监测数据表(.mdb/.accdb)</w:t>
+              <w:t>保留频域与时域特征，关联数据集-通道-特征</w:t>
             </w:r>
           </w:p>
         </w:tc>
@@ -2610,6 +2508,7 @@
                 <w:b w:val="0"/>
                 <w:sz w:val="21"/>
               </w:rPr>
+              <w:t>振动数据表组</w:t>
             </w:r>
           </w:p>
         </w:tc>
@@ -2630,7 +2529,7 @@
                 <w:b w:val="0"/>
                 <w:sz w:val="21"/>
               </w:rPr>
-              <w:t>监测        波形文件/</w:t>
+              <w:t>InSAR遥感</w:t>
             </w:r>
           </w:p>
         </w:tc>
@@ -2649,7 +2548,7 @@
                 <w:b w:val="0"/>
                 <w:sz w:val="21"/>
               </w:rPr>
-              <w:t>SV    保留频域与时域特征</w:t>
+              <w:t>Shapefile (.shp)</w:t>
             </w:r>
           </w:p>
         </w:tc>
@@ -2668,7 +2567,7 @@
                 <w:b w:val="0"/>
                 <w:sz w:val="21"/>
               </w:rPr>
-              <w:t>关联数据集-通道-特征    振动数据表组</w:t>
+              <w:t>坐标转换、聚类分区、时序提取</w:t>
             </w:r>
           </w:p>
         </w:tc>
@@ -2687,160 +2586,7 @@
                 <w:b w:val="0"/>
                 <w:sz w:val="21"/>
               </w:rPr>
-            </w:r>
-          </w:p>
-        </w:tc>
-      </w:tr>
-      <w:tr>
-        <w:tc>
-          <w:tcPr>
-            <w:tcW w:type="dxa" w:w="2197"/>
-          </w:tcPr>
-          <w:p>
-            <w:pPr>
-              <w:spacing w:before="0" w:after="0" w:line="320" w:lineRule="exact"/>
-            </w:pPr>
-            <w:r/>
-            <w:r>
-              <w:rPr>
-                <w:rFonts w:ascii="Times New Roman" w:hAnsi="Times New Roman" w:eastAsia="宋体"/>
-                <w:b w:val="0"/>
-                <w:sz w:val="21"/>
-              </w:rPr>
-              <w:t>SAR遥感       Sha</w:t>
-            </w:r>
-          </w:p>
-        </w:tc>
-        <w:tc>
-          <w:tcPr>
-            <w:tcW w:type="dxa" w:w="2197"/>
-          </w:tcPr>
-          <w:p>
-            <w:pPr>
-              <w:spacing w:before="0" w:after="0" w:line="320" w:lineRule="exact"/>
-            </w:pPr>
-            <w:r/>
-            <w:r>
-              <w:rPr>
-                <w:rFonts w:ascii="Times New Roman" w:hAnsi="Times New Roman" w:eastAsia="宋体"/>
-                <w:b w:val="0"/>
-                <w:sz w:val="21"/>
-              </w:rPr>
-              <w:t>efile       坐标转</w:t>
-            </w:r>
-          </w:p>
-        </w:tc>
-        <w:tc>
-          <w:tcPr>
-            <w:tcW w:type="dxa" w:w="2197"/>
-          </w:tcPr>
-          <w:p>
-            <w:pPr>
-              <w:spacing w:before="0" w:after="0" w:line="320" w:lineRule="exact"/>
-            </w:pPr>
-            <w:r/>
-            <w:r>
-              <w:rPr>
-                <w:rFonts w:ascii="Times New Roman" w:hAnsi="Times New Roman" w:eastAsia="宋体"/>
-                <w:b w:val="0"/>
-                <w:sz w:val="21"/>
-              </w:rPr>
-              <w:t>、聚类分区、时序提取                磁盘缓存(.shp)</w:t>
-            </w:r>
-          </w:p>
-        </w:tc>
-        <w:tc>
-          <w:tcPr>
-            <w:tcW w:type="dxa" w:w="2197"/>
-          </w:tcPr>
-          <w:p>
-            <w:pPr>
-              <w:spacing w:before="0" w:after="0" w:line="320" w:lineRule="exact"/>
-            </w:pPr>
-            <w:r/>
-            <w:r>
-              <w:rPr>
-                <w:rFonts w:ascii="Times New Roman" w:hAnsi="Times New Roman" w:eastAsia="宋体"/>
-                <w:b w:val="0"/>
-                <w:sz w:val="21"/>
-              </w:rPr>
-            </w:r>
-          </w:p>
-        </w:tc>
-      </w:tr>
-      <w:tr>
-        <w:tc>
-          <w:tcPr>
-            <w:tcW w:type="dxa" w:w="2197"/>
-          </w:tcPr>
-          <w:p>
-            <w:pPr>
-              <w:spacing w:before="0" w:after="0" w:line="320" w:lineRule="exact"/>
-            </w:pPr>
-            <w:r/>
-            <w:r>
-              <w:rPr>
-                <w:rFonts w:ascii="Times New Roman" w:hAnsi="Times New Roman" w:eastAsia="宋体"/>
-                <w:b w:val="0"/>
-                <w:sz w:val="21"/>
-              </w:rPr>
-              <w:t>SAR遥感       Sha</w:t>
-            </w:r>
-          </w:p>
-        </w:tc>
-        <w:tc>
-          <w:tcPr>
-            <w:tcW w:type="dxa" w:w="2197"/>
-          </w:tcPr>
-          <w:p>
-            <w:pPr>
-              <w:spacing w:before="0" w:after="0" w:line="320" w:lineRule="exact"/>
-            </w:pPr>
-            <w:r/>
-            <w:r>
-              <w:rPr>
-                <w:rFonts w:ascii="Times New Roman" w:hAnsi="Times New Roman" w:eastAsia="宋体"/>
-                <w:b w:val="0"/>
-                <w:sz w:val="21"/>
-              </w:rPr>
-              <w:t>efile       坐标转</w:t>
-            </w:r>
-          </w:p>
-        </w:tc>
-        <w:tc>
-          <w:tcPr>
-            <w:tcW w:type="dxa" w:w="2197"/>
-          </w:tcPr>
-          <w:p>
-            <w:pPr>
-              <w:spacing w:before="0" w:after="0" w:line="320" w:lineRule="exact"/>
-            </w:pPr>
-            <w:r/>
-            <w:r>
-              <w:rPr>
-                <w:rFonts w:ascii="Times New Roman" w:hAnsi="Times New Roman" w:eastAsia="宋体"/>
-                <w:b w:val="0"/>
-                <w:sz w:val="21"/>
-              </w:rPr>
-              <w:t>、聚类分区、时序提取                磁盘缓存(.shp)</w:t>
-            </w:r>
-          </w:p>
-        </w:tc>
-        <w:tc>
-          <w:tcPr>
-            <w:tcW w:type="dxa" w:w="2197"/>
-          </w:tcPr>
-          <w:p>
-            <w:pPr>
-              <w:spacing w:before="0" w:after="0" w:line="320" w:lineRule="exact"/>
-            </w:pPr>
-            <w:r/>
-            <w:r>
-              <w:rPr>
-                <w:rFonts w:ascii="Times New Roman" w:hAnsi="Times New Roman" w:eastAsia="宋体"/>
-                <w:b w:val="0"/>
-                <w:sz w:val="21"/>
-              </w:rPr>
+              <w:t>磁盘缓存</w:t>
             </w:r>
           </w:p>
         </w:tc>
@@ -3392,7 +3138,27 @@
                 <w:b/>
                 <w:sz w:val="21"/>
               </w:rPr>
-              <w:t>模型名称              功能定</w:t>
+              <w:t>模型名称</w:t>
+            </w:r>
+          </w:p>
+        </w:tc>
+        <w:tc>
+          <w:tcPr>
+            <w:tcW w:type="dxa" w:w="2929"/>
+          </w:tcPr>
+          <w:p>
+            <w:pPr>
+              <w:jc w:val="center"/>
+              <w:spacing w:before="0" w:after="0" w:line="320" w:lineRule="exact"/>
+            </w:pPr>
+            <w:r/>
+            <w:r>
+              <w:rPr>
+                <w:rFonts w:ascii="Times New Roman" w:hAnsi="Times New Roman" w:eastAsia="黑体"/>
+                <w:b/>
+                <w:sz w:val="21"/>
+              </w:rPr>
+              <w:t>功能定位</w:t>
             </w:r>
           </w:p>
         </w:tc>
@@ -3416,22 +3182,62 @@
             </w:r>
           </w:p>
         </w:tc>
+      </w:tr>
+      <w:tr>
         <w:tc>
           <w:tcPr>
             <w:tcW w:type="dxa" w:w="2929"/>
           </w:tcPr>
           <w:p>
             <w:pPr>
-              <w:jc w:val="center"/>
               <w:spacing w:before="0" w:after="0" w:line="320" w:lineRule="exact"/>
             </w:pPr>
             <w:r/>
             <w:r>
               <w:rPr>
-                <w:rFonts w:ascii="Times New Roman" w:hAnsi="Times New Roman" w:eastAsia="黑体"/>
-                <w:b/>
+                <w:rFonts w:ascii="Times New Roman" w:hAnsi="Times New Roman" w:eastAsia="宋体"/>
+                <w:b w:val="0"/>
                 <w:sz w:val="21"/>
               </w:rPr>
+              <w:t>Prophet</w:t>
+            </w:r>
+          </w:p>
+        </w:tc>
+        <w:tc>
+          <w:tcPr>
+            <w:tcW w:type="dxa" w:w="2929"/>
+          </w:tcPr>
+          <w:p>
+            <w:pPr>
+              <w:spacing w:before="0" w:after="0" w:line="320" w:lineRule="exact"/>
+            </w:pPr>
+            <w:r/>
+            <w:r>
+              <w:rPr>
+                <w:rFonts w:ascii="Times New Roman" w:hAnsi="Times New Roman" w:eastAsia="宋体"/>
+                <w:b w:val="0"/>
+                <w:sz w:val="21"/>
+              </w:rPr>
+              <w:t>时序分解与趋势预测</w:t>
+            </w:r>
+          </w:p>
+        </w:tc>
+        <w:tc>
+          <w:tcPr>
+            <w:tcW w:type="dxa" w:w="2929"/>
+          </w:tcPr>
+          <w:p>
+            <w:pPr>
+              <w:spacing w:before="0" w:after="0" w:line="320" w:lineRule="exact"/>
+            </w:pPr>
+            <w:r/>
+            <w:r>
+              <w:rPr>
+                <w:rFonts w:ascii="Times New Roman" w:hAnsi="Times New Roman" w:eastAsia="宋体"/>
+                <w:b w:val="0"/>
+                <w:sz w:val="21"/>
+              </w:rPr>
+              <w:t>ExponentialSmoothing（指数平滑）</w:t>
             </w:r>
           </w:p>
         </w:tc>
@@ -3452,7 +3258,7 @@
                 <w:b w:val="0"/>
                 <w:sz w:val="21"/>
               </w:rPr>
-              <w:t>ophet               时</w:t>
+              <w:t>ARIMA/SARIMA</w:t>
             </w:r>
           </w:p>
         </w:tc>
@@ -3471,7 +3277,7 @@
                 <w:b w:val="0"/>
                 <w:sz w:val="21"/>
               </w:rPr>
-              <w:t>分解与趋势预测                    Exponentia</w:t>
+              <w:t>非平稳序列差分预测</w:t>
             </w:r>
           </w:p>
         </w:tc>
@@ -3490,7 +3296,7 @@
                 <w:b w:val="0"/>
                 <w:sz w:val="21"/>
               </w:rPr>
-              <w:t>Smoothing（指数平滑）</w:t>
+              <w:t>—（原生Scikit-learn实现）</w:t>
             </w:r>
           </w:p>
         </w:tc>
@@ -3511,7 +3317,7 @@
                 <w:b w:val="0"/>
                 <w:sz w:val="21"/>
               </w:rPr>
-              <w:t>IMA/SARIMA          非</w:t>
+              <w:t>Informer</w:t>
             </w:r>
           </w:p>
         </w:tc>
@@ -3530,7 +3336,7 @@
                 <w:b w:val="0"/>
                 <w:sz w:val="21"/>
               </w:rPr>
-              <w:t>稳序列差分预测                    —（原生Scikit</w:t>
+              <w:t>长序列时序预测</w:t>
             </w:r>
           </w:p>
         </w:tc>
@@ -3549,7 +3355,7 @@
                 <w:b w:val="0"/>
                 <w:sz w:val="21"/>
               </w:rPr>
-              <w:t>learn实现）</w:t>
+              <w:t>GradientBoosting+滞后特征</w:t>
             </w:r>
           </w:p>
         </w:tc>
@@ -3570,7 +3376,7 @@
                 <w:b w:val="0"/>
                 <w:sz w:val="21"/>
               </w:rPr>
-              <w:t>former              长</w:t>
+              <w:t>STGCN</w:t>
             </w:r>
           </w:p>
         </w:tc>
@@ -3589,7 +3395,7 @@
                 <w:b w:val="0"/>
                 <w:sz w:val="21"/>
               </w:rPr>
-              <w:t>列时序预测                        Gradient</w:t>
+              <w:t>时空图卷积多点联合预测</w:t>
             </w:r>
           </w:p>
         </w:tc>
@@ -3608,7 +3414,7 @@
                 <w:b w:val="0"/>
                 <w:sz w:val="21"/>
               </w:rPr>
-              <w:t>oosting+滞后特征</w:t>
+              <w:t>RandomForest+近邻空间特征</w:t>
             </w:r>
           </w:p>
         </w:tc>
@@ -3629,7 +3435,7 @@
                 <w:b w:val="0"/>
                 <w:sz w:val="21"/>
               </w:rPr>
-              <w:t>GCN                 时</w:t>
+              <w:t>PINN</w:t>
             </w:r>
           </w:p>
         </w:tc>
@@ -3648,7 +3454,7 @@
                 <w:b w:val="0"/>
                 <w:sz w:val="21"/>
               </w:rPr>
-              <w:t>图卷积多点联合预测                RandomForest</w:t>
+              <w:t>物理信息约束神经网络</w:t>
             </w:r>
           </w:p>
         </w:tc>
@@ -3667,7 +3473,7 @@
                 <w:b w:val="0"/>
                 <w:sz w:val="21"/>
               </w:rPr>
-              <w:t>近邻空间特征</w:t>
+              <w:t>GradientBoosting+Terzaghi物理项</w:t>
             </w:r>
           </w:p>
         </w:tc>
@@ -3688,7 +3494,7 @@
                 <w:b w:val="0"/>
                 <w:sz w:val="21"/>
               </w:rPr>
-              <w:t>NN                  物</w:t>
+              <w:t>Ensemble</w:t>
             </w:r>
           </w:p>
         </w:tc>
@@ -3707,7 +3513,7 @@
                 <w:b w:val="0"/>
                 <w:sz w:val="21"/>
               </w:rPr>
-              <w:t>信息约束神经网络                  GradientBoo</w:t>
+              <w:t>多模型集成学习</w:t>
             </w:r>
           </w:p>
         </w:tc>
@@ -3726,7 +3532,7 @@
                 <w:b w:val="0"/>
                 <w:sz w:val="21"/>
               </w:rPr>
-              <w:t>ting+Terzaghi物理项</w:t>
+              <w:t>GB+RF+多项式加权平均</w:t>
             </w:r>
           </w:p>
         </w:tc>
@@ -3747,7 +3553,7 @@
                 <w:b w:val="0"/>
                 <w:sz w:val="21"/>
               </w:rPr>
-              <w:t>semble              多</w:t>
+              <w:t>Isolation Forest</w:t>
             </w:r>
           </w:p>
         </w:tc>
@@ -3766,7 +3572,7 @@
                 <w:b w:val="0"/>
                 <w:sz w:val="21"/>
               </w:rPr>
-              <w:t>型集成学习                        GB+RF+多项</w:t>
+              <w:t>基于孤立性的异常检测</w:t>
             </w:r>
           </w:p>
         </w:tc>
@@ -3785,7 +3591,7 @@
                 <w:b w:val="0"/>
                 <w:sz w:val="21"/>
               </w:rPr>
-              <w:t>加权平均</w:t>
+              <w:t>—（原生Scikit-learn实现）</w:t>
             </w:r>
           </w:p>
         </w:tc>
@@ -3806,7 +3612,7 @@
                 <w:b w:val="0"/>
                 <w:sz w:val="21"/>
               </w:rPr>
-              <w:t>olation Forest      基</w:t>
+              <w:t>LOF</w:t>
             </w:r>
           </w:p>
         </w:tc>
@@ -3825,7 +3631,7 @@
                 <w:b w:val="0"/>
                 <w:sz w:val="21"/>
               </w:rPr>
-              <w:t>孤立性的异常检测                  —（原生Scikit-</w:t>
+              <w:t>基于局部密度的异常检测</w:t>
             </w:r>
           </w:p>
         </w:tc>
@@ -3844,7 +3650,7 @@
                 <w:b w:val="0"/>
                 <w:sz w:val="21"/>
               </w:rPr>
-              <w:t>earn实现）</w:t>
+              <w:t>—（原生Scikit-learn实现）</w:t>
             </w:r>
           </w:p>
         </w:tc>
@@ -3865,7 +3671,7 @@
                 <w:b w:val="0"/>
                 <w:sz w:val="21"/>
               </w:rPr>
-              <w:t>F                   基</w:t>
+              <w:t>SHAP</w:t>
             </w:r>
           </w:p>
         </w:tc>
@@ -3884,7 +3690,7 @@
                 <w:b w:val="0"/>
                 <w:sz w:val="21"/>
               </w:rPr>
-              <w:t>局部密度的异常检测                —（原生Scikit-l</w:t>
+              <w:t>模型可解释性分析</w:t>
             </w:r>
           </w:p>
         </w:tc>
@@ -3903,7 +3709,7 @@
                 <w:b w:val="0"/>
                 <w:sz w:val="21"/>
               </w:rPr>
-              <w:t>arn实现）</w:t>
+              <w:t>—（依赖原生SHAP库）</w:t>
             </w:r>
           </w:p>
         </w:tc>
@@ -3924,7 +3730,7 @@
                 <w:b w:val="0"/>
                 <w:sz w:val="21"/>
               </w:rPr>
-              <w:t>AP                  模</w:t>
+              <w:t>NetworkX知识图谱</w:t>
             </w:r>
           </w:p>
         </w:tc>
@@ -3943,7 +3749,7 @@
                 <w:b w:val="0"/>
                 <w:sz w:val="21"/>
               </w:rPr>
-              <w:t>可解释性分析                      —（依赖原生SHA</w:t>
+              <w:t>监测点空间关系与知识融合</w:t>
             </w:r>
           </w:p>
         </w:tc>
@@ -3962,123 +3768,7 @@
                 <w:b w:val="0"/>
                 <w:sz w:val="21"/>
               </w:rPr>
-              <w:t>库）</w:t>
-            </w:r>
-          </w:p>
-        </w:tc>
-      </w:tr>
-      <w:tr>
-        <w:tc>
-          <w:tcPr>
-            <w:tcW w:type="dxa" w:w="2929"/>
-          </w:tcPr>
-          <w:p>
-            <w:pPr>
-              <w:spacing w:before="0" w:after="0" w:line="320" w:lineRule="exact"/>
-            </w:pPr>
-            <w:r/>
-            <w:r>
-              <w:rPr>
-                <w:rFonts w:ascii="Times New Roman" w:hAnsi="Times New Roman" w:eastAsia="宋体"/>
-                <w:b w:val="0"/>
-                <w:sz w:val="21"/>
-              </w:rPr>
-              <w:t>tworkX知识图谱       监测点空</w:t>
-            </w:r>
-          </w:p>
-        </w:tc>
-        <w:tc>
-          <w:tcPr>
-            <w:tcW w:type="dxa" w:w="2929"/>
-          </w:tcPr>
-          <w:p>
-            <w:pPr>
-              <w:spacing w:before="0" w:after="0" w:line="320" w:lineRule="exact"/>
-            </w:pPr>
-            <w:r/>
-            <w:r>
-              <w:rPr>
-                <w:rFonts w:ascii="Times New Roman" w:hAnsi="Times New Roman" w:eastAsia="宋体"/>
-                <w:b w:val="0"/>
-                <w:sz w:val="21"/>
-              </w:rPr>
-              <w:t>关系与知识融合              —（纯Python图计算）</w:t>
-            </w:r>
-          </w:p>
-        </w:tc>
-        <w:tc>
-          <w:tcPr>
-            <w:tcW w:type="dxa" w:w="2929"/>
-          </w:tcPr>
-          <w:p>
-            <w:pPr>
-              <w:spacing w:before="0" w:after="0" w:line="320" w:lineRule="exact"/>
-            </w:pPr>
-            <w:r/>
-            <w:r>
-              <w:rPr>
-                <w:rFonts w:ascii="Times New Roman" w:hAnsi="Times New Roman" w:eastAsia="宋体"/>
-                <w:b w:val="0"/>
-                <w:sz w:val="21"/>
-              </w:rPr>
-            </w:r>
-          </w:p>
-        </w:tc>
-      </w:tr>
-      <w:tr>
-        <w:tc>
-          <w:tcPr>
-            <w:tcW w:type="dxa" w:w="2929"/>
-          </w:tcPr>
-          <w:p>
-            <w:pPr>
-              <w:spacing w:before="0" w:after="0" w:line="320" w:lineRule="exact"/>
-            </w:pPr>
-            <w:r/>
-            <w:r>
-              <w:rPr>
-                <w:rFonts w:ascii="Times New Roman" w:hAnsi="Times New Roman" w:eastAsia="宋体"/>
-                <w:b w:val="0"/>
-                <w:sz w:val="21"/>
-              </w:rPr>
-              <w:t>tworkX知识图谱       监测点空</w:t>
-            </w:r>
-          </w:p>
-        </w:tc>
-        <w:tc>
-          <w:tcPr>
-            <w:tcW w:type="dxa" w:w="2929"/>
-          </w:tcPr>
-          <w:p>
-            <w:pPr>
-              <w:spacing w:before="0" w:after="0" w:line="320" w:lineRule="exact"/>
-            </w:pPr>
-            <w:r/>
-            <w:r>
-              <w:rPr>
-                <w:rFonts w:ascii="Times New Roman" w:hAnsi="Times New Roman" w:eastAsia="宋体"/>
-                <w:b w:val="0"/>
-                <w:sz w:val="21"/>
-              </w:rPr>
-              <w:t>关系与知识融合              —（纯Python图计算）</w:t>
-            </w:r>
-          </w:p>
-        </w:tc>
-        <w:tc>
-          <w:tcPr>
-            <w:tcW w:type="dxa" w:w="2929"/>
-          </w:tcPr>
-          <w:p>
-            <w:pPr>
-              <w:spacing w:before="0" w:after="0" w:line="320" w:lineRule="exact"/>
-            </w:pPr>
-            <w:r/>
-            <w:r>
-              <w:rPr>
-                <w:rFonts w:ascii="Times New Roman" w:hAnsi="Times New Roman" w:eastAsia="宋体"/>
-                <w:b w:val="0"/>
-                <w:sz w:val="21"/>
-              </w:rPr>
+              <w:t>—（纯Python图计算）</w:t>
             </w:r>
           </w:p>
         </w:tc>

</xml_diff>

<commit_message>
vault backup: 2026-04-12 18:35:58
Affected files:
.obsidian/workspace.json
task.md.md
wkspc/chapter7_final.docx
wkspc/figure_list.txt
wkspc/format_chapter7.py
wkspc/placeholders/图7-1.png
wkspc/placeholders/图7-2.png
wkspc/placeholders/图7-3.png
wkspc/placeholders/图7-4.png
</commit_message>
<xml_diff>
--- a/wkspc/chapter7_final.docx
+++ b/wkspc/chapter7_final.docx
@@ -55,71 +55,7 @@
           <w:b w:val="0"/>
           <w:sz w:val="24"/>
         </w:rPr>
-        <w:t>围绕隧道暗挖施工全过程的监测管控需求，系统将业务划分为四大功能域，共计15个功能模块，如表7-2所示。第一类为</w:t>
-      </w:r>
-      <w:r>
-        <w:rPr>
-          <w:rFonts w:ascii="Times New Roman" w:hAnsi="Times New Roman" w:eastAsia="宋体"/>
-          <w:b/>
-          <w:sz w:val="24"/>
-        </w:rPr>
-        <w:t>变形与结构安全监测</w:t>
-      </w:r>
-      <w:r>
-        <w:rPr>
-          <w:rFonts w:ascii="Times New Roman" w:hAnsi="Times New Roman" w:eastAsia="宋体"/>
-          <w:b w:val="0"/>
-          <w:sz w:val="24"/>
-        </w:rPr>
-        <w:t>，涵盖地表沉降监测、围岩裂缝监测、钢筋应力监测及InSAR卫星遥感（InterferometricSynthetic ApertureRadar，简称InSAR）地表形变分析四个模块，分别对应隧道施工中最为关键的竖向位移、结构损伤、受力状态和区域形变四类监测指标。第二类为</w:t>
-      </w:r>
-      <w:r>
-        <w:rPr>
-          <w:rFonts w:ascii="Times New Roman" w:hAnsi="Times New Roman" w:eastAsia="宋体"/>
-          <w:b/>
-          <w:sz w:val="24"/>
-        </w:rPr>
-        <w:t>施工环境监测</w:t>
-      </w:r>
-      <w:r>
-        <w:rPr>
-          <w:rFonts w:ascii="Times New Roman" w:hAnsi="Times New Roman" w:eastAsia="宋体"/>
-          <w:b w:val="0"/>
-          <w:sz w:val="24"/>
-        </w:rPr>
-        <w:t>，包括隧道内温湿度采集和施工振动监测两个模块，用于掌握洞内环境参数和爆破振动对周边建构筑物的影响。第三类为</w:t>
-      </w:r>
-      <w:r>
-        <w:rPr>
-          <w:rFonts w:ascii="Times New Roman" w:hAnsi="Times New Roman" w:eastAsia="宋体"/>
-          <w:b/>
-          <w:sz w:val="24"/>
-        </w:rPr>
-        <w:t>施工过程管控</w:t>
-      </w:r>
-      <w:r>
-        <w:rPr>
-          <w:rFonts w:ascii="Times New Roman" w:hAnsi="Times New Roman" w:eastAsia="宋体"/>
-          <w:b w:val="0"/>
-          <w:sz w:val="24"/>
-        </w:rPr>
-        <w:t>，包含盾构机轨迹追踪、施工工单管理、隧道断面管理和数据批量导入四个模块，支撑从掘进参数监控、问题闭环处理到断面级风险评估的施工管理流程。第四类为</w:t>
-      </w:r>
-      <w:r>
-        <w:rPr>
-          <w:rFonts w:ascii="Times New Roman" w:hAnsi="Times New Roman" w:eastAsia="宋体"/>
-          <w:b/>
-          <w:sz w:val="24"/>
-        </w:rPr>
-        <w:t>智能分析与决策</w:t>
-      </w:r>
-      <w:r>
-        <w:rPr>
-          <w:rFonts w:ascii="Times New Roman" w:hAnsi="Times New Roman" w:eastAsia="宋体"/>
-          <w:b w:val="0"/>
-          <w:sz w:val="24"/>
-        </w:rPr>
-        <w:t>，包括沉降预测分析、多指标异常检测、高级统计分析、AI智能助手和总览仪表盘五个模块，为工程师提供从趋势预判、异常预警到辅助决策的全链路智能分析能力。</w:t>
+        <w:t>围绕隧道暗挖施工全过程的监测管控需求，系统将业务划分为四大功能域，共计15个功能模块，如表7-2所示。第一类为变形与结构安全监测，涵盖地表沉降监测、围岩裂缝监测、钢筋应力监测及InSAR卫星遥感（InterferometricSynthetic ApertureRadar，简称InSAR）地表形变分析四个模块，分别对应隧道施工中最为关键的竖向位移、结构损伤、受力状态和区域形变四类监测指标。第二类为施工环境监测，包括隧道内温湿度采集和施工振动监测两个模块，用于掌握洞内环境参数和爆破振动对周边建构筑物的影响。第三类为施工过程管控，包含盾构机轨迹追踪、施工工单管理、隧道断面管理和数据批量导入四个模块，支撑从掘进参数监控、问题闭环处理到断面级风险评估的施工管理流程。第四类为智能分析与决策，包括沉降预测分析、多指标异常检测、高级统计分析、AI智能助手和总览仪表盘五个模块，为工程师提供从趋势预判、异常预警到辅助决策的全链路智能分析能力。</w:t>
       </w:r>
     </w:p>
     <w:p>
@@ -1101,6 +1037,46 @@
     <w:p>
       <w:pPr>
         <w:jc w:val="center"/>
+        <w:spacing w:before="120" w:after="0" w:line="320" w:lineRule="exact"/>
+      </w:pPr>
+      <w:r>
+        <w:drawing>
+          <wp:inline xmlns:a="http://schemas.openxmlformats.org/drawingml/2006/main" xmlns:pic="http://schemas.openxmlformats.org/drawingml/2006/picture">
+            <wp:extent cx="4680000" cy="2880000"/>
+            <wp:docPr id="1" name="Picture 1"/>
+            <wp:cNvGraphicFramePr>
+              <a:graphicFrameLocks noChangeAspect="1"/>
+            </wp:cNvGraphicFramePr>
+            <a:graphic>
+              <a:graphicData uri="http://schemas.openxmlformats.org/drawingml/2006/picture">
+                <pic:pic>
+                  <pic:nvPicPr>
+                    <pic:cNvPr id="0" name="图7-1.png"/>
+                    <pic:cNvPicPr/>
+                  </pic:nvPicPr>
+                  <pic:blipFill>
+                    <a:blip r:embed="rId9"/>
+                    <a:stretch>
+                      <a:fillRect/>
+                    </a:stretch>
+                  </pic:blipFill>
+                  <pic:spPr>
+                    <a:xfrm>
+                      <a:off x="0" y="0"/>
+                      <a:ext cx="4680000" cy="2880000"/>
+                    </a:xfrm>
+                    <a:prstGeom prst="rect"/>
+                  </pic:spPr>
+                </pic:pic>
+              </a:graphicData>
+            </a:graphic>
+          </wp:inline>
+        </w:drawing>
+      </w:r>
+    </w:p>
+    <w:p>
+      <w:pPr>
+        <w:jc w:val="center"/>
         <w:spacing w:before="120" w:after="240"/>
       </w:pPr>
       <w:r>
@@ -2068,6 +2044,46 @@
     <w:p>
       <w:pPr>
         <w:jc w:val="center"/>
+        <w:spacing w:before="120" w:after="0" w:line="320" w:lineRule="exact"/>
+      </w:pPr>
+      <w:r>
+        <w:drawing>
+          <wp:inline xmlns:a="http://schemas.openxmlformats.org/drawingml/2006/main" xmlns:pic="http://schemas.openxmlformats.org/drawingml/2006/picture">
+            <wp:extent cx="4680000" cy="2880000"/>
+            <wp:docPr id="2" name="Picture 2"/>
+            <wp:cNvGraphicFramePr>
+              <a:graphicFrameLocks noChangeAspect="1"/>
+            </wp:cNvGraphicFramePr>
+            <a:graphic>
+              <a:graphicData uri="http://schemas.openxmlformats.org/drawingml/2006/picture">
+                <pic:pic>
+                  <pic:nvPicPr>
+                    <pic:cNvPr id="0" name="图7-2.png"/>
+                    <pic:cNvPicPr/>
+                  </pic:nvPicPr>
+                  <pic:blipFill>
+                    <a:blip r:embed="rId10"/>
+                    <a:stretch>
+                      <a:fillRect/>
+                    </a:stretch>
+                  </pic:blipFill>
+                  <pic:spPr>
+                    <a:xfrm>
+                      <a:off x="0" y="0"/>
+                      <a:ext cx="4680000" cy="2880000"/>
+                    </a:xfrm>
+                    <a:prstGeom prst="rect"/>
+                  </pic:spPr>
+                </pic:pic>
+              </a:graphicData>
+            </a:graphic>
+          </wp:inline>
+        </w:drawing>
+      </w:r>
+    </w:p>
+    <w:p>
+      <w:pPr>
+        <w:jc w:val="center"/>
         <w:spacing w:before="120" w:after="240"/>
       </w:pPr>
       <w:r>
@@ -2679,6 +2695,46 @@
     <w:p>
       <w:pPr>
         <w:jc w:val="center"/>
+        <w:spacing w:before="120" w:after="0" w:line="320" w:lineRule="exact"/>
+      </w:pPr>
+      <w:r>
+        <w:drawing>
+          <wp:inline xmlns:a="http://schemas.openxmlformats.org/drawingml/2006/main" xmlns:pic="http://schemas.openxmlformats.org/drawingml/2006/picture">
+            <wp:extent cx="4680000" cy="2880000"/>
+            <wp:docPr id="3" name="Picture 3"/>
+            <wp:cNvGraphicFramePr>
+              <a:graphicFrameLocks noChangeAspect="1"/>
+            </wp:cNvGraphicFramePr>
+            <a:graphic>
+              <a:graphicData uri="http://schemas.openxmlformats.org/drawingml/2006/picture">
+                <pic:pic>
+                  <pic:nvPicPr>
+                    <pic:cNvPr id="0" name="图7-3.png"/>
+                    <pic:cNvPicPr/>
+                  </pic:nvPicPr>
+                  <pic:blipFill>
+                    <a:blip r:embed="rId11"/>
+                    <a:stretch>
+                      <a:fillRect/>
+                    </a:stretch>
+                  </pic:blipFill>
+                  <pic:spPr>
+                    <a:xfrm>
+                      <a:off x="0" y="0"/>
+                      <a:ext cx="4680000" cy="2880000"/>
+                    </a:xfrm>
+                    <a:prstGeom prst="rect"/>
+                  </pic:spPr>
+                </pic:pic>
+              </a:graphicData>
+            </a:graphic>
+          </wp:inline>
+        </w:drawing>
+      </w:r>
+    </w:p>
+    <w:p>
+      <w:pPr>
+        <w:jc w:val="center"/>
         <w:spacing w:before="120" w:after="240"/>
       </w:pPr>
       <w:r>
@@ -3024,6 +3080,46 @@
           <w:sz w:val="24"/>
         </w:rPr>
         <w:t>AI助手的核心采用ReAct（Reasoning and Acting）推理框架实现。ReAct框架将大语言模型的推理过程结构化为"思考—行动—观察"三步循环：在每一轮迭代中，模型首先分析用户意图并推理当前应采取的行动（思考阶段），随后调用相应的数据查询或分析工具执行具体操作（行动阶段），最后根据工具返回的结果进行判断，决定是否需要继续调用其他工具或直接生成最终回复（观察阶段）。系统为ReAct引擎配备了16个专用工具，覆盖监测数据查询（监测点列表查询、沉降数据查询、温度数据查询、裂缝数据查询）、智能分析调用（异常检测、沉降预测、相关性分析、异常批量查询）、知识图谱操作（知识图谱构建与查询、知识图谱问答）以及辅助功能（施工事件查询、温度风险评估、温度处置方案、分析摘要查询、学术文献检索）等四大类能力，使助手能够在对话过程中动态调用系统的各项分析功能获取实时数据，而非仅依赖语言模型的静态知识作答。考虑到Serverless环境的执行时间限制，系统将ReAct循环的最大迭代次数设为2次，单次请求的硬超时设为45秒，工具返回结果超过2000字符时自动截断并保留最重要的前5条记录，从而在推理深度与响应速度之间取得平衡。</w:t>
+      </w:r>
+    </w:p>
+    <w:p>
+      <w:pPr>
+        <w:jc w:val="center"/>
+        <w:spacing w:before="120" w:after="0" w:line="320" w:lineRule="exact"/>
+      </w:pPr>
+      <w:r>
+        <w:drawing>
+          <wp:inline xmlns:a="http://schemas.openxmlformats.org/drawingml/2006/main" xmlns:pic="http://schemas.openxmlformats.org/drawingml/2006/picture">
+            <wp:extent cx="4680000" cy="2880000"/>
+            <wp:docPr id="4" name="Picture 4"/>
+            <wp:cNvGraphicFramePr>
+              <a:graphicFrameLocks noChangeAspect="1"/>
+            </wp:cNvGraphicFramePr>
+            <a:graphic>
+              <a:graphicData uri="http://schemas.openxmlformats.org/drawingml/2006/picture">
+                <pic:pic>
+                  <pic:nvPicPr>
+                    <pic:cNvPr id="0" name="图7-4.png"/>
+                    <pic:cNvPicPr/>
+                  </pic:nvPicPr>
+                  <pic:blipFill>
+                    <a:blip r:embed="rId12"/>
+                    <a:stretch>
+                      <a:fillRect/>
+                    </a:stretch>
+                  </pic:blipFill>
+                  <pic:spPr>
+                    <a:xfrm>
+                      <a:off x="0" y="0"/>
+                      <a:ext cx="4680000" cy="2880000"/>
+                    </a:xfrm>
+                    <a:prstGeom prst="rect"/>
+                  </pic:spPr>
+                </pic:pic>
+              </a:graphicData>
+            </a:graphic>
+          </wp:inline>
+        </w:drawing>
       </w:r>
     </w:p>
     <w:p>

</xml_diff>

<commit_message>
vault backup: 2026-04-12 18:45:50
Affected files:
wkspc/chapter7_final.docx
wkspc/format_chapter7.py
</commit_message>
<xml_diff>
--- a/wkspc/chapter7_final.docx
+++ b/wkspc/chapter7_final.docx
@@ -1037,7 +1037,7 @@
     <w:p>
       <w:pPr>
         <w:jc w:val="center"/>
-        <w:spacing w:before="120" w:after="0" w:line="320" w:lineRule="exact"/>
+        <w:spacing w:before="240" w:after="0" w:lineRule="auto" w:line="240"/>
       </w:pPr>
       <w:r>
         <w:drawing>
@@ -2044,7 +2044,7 @@
     <w:p>
       <w:pPr>
         <w:jc w:val="center"/>
-        <w:spacing w:before="120" w:after="0" w:line="320" w:lineRule="exact"/>
+        <w:spacing w:before="240" w:after="0" w:lineRule="auto" w:line="240"/>
       </w:pPr>
       <w:r>
         <w:drawing>
@@ -2695,7 +2695,7 @@
     <w:p>
       <w:pPr>
         <w:jc w:val="center"/>
-        <w:spacing w:before="120" w:after="0" w:line="320" w:lineRule="exact"/>
+        <w:spacing w:before="240" w:after="0" w:lineRule="auto" w:line="240"/>
       </w:pPr>
       <w:r>
         <w:drawing>
@@ -3085,7 +3085,7 @@
     <w:p>
       <w:pPr>
         <w:jc w:val="center"/>
-        <w:spacing w:before="120" w:after="0" w:line="320" w:lineRule="exact"/>
+        <w:spacing w:before="240" w:after="0" w:lineRule="auto" w:line="240"/>
       </w:pPr>
       <w:r>
         <w:drawing>

</xml_diff>